<commit_message>
Technisches Konzept - Mockups Wizard
</commit_message>
<xml_diff>
--- a/Dokumentation/Projektdokumentation/Technisches Konzept/Technisches Konzept.docx
+++ b/Dokumentation/Projektdokumentation/Technisches Konzept/Technisches Konzept.docx
@@ -1658,7 +1658,7 @@
       </w:pPr>
       <w:r>
         <w:drawing>
-          <wp:anchor distT="0" distB="0" distL="0" distR="0" simplePos="0" relativeHeight="2" behindDoc="0" locked="0" layoutInCell="0" allowOverlap="1">
+          <wp:anchor distT="0" distB="0" distL="0" distR="0" simplePos="0" relativeHeight="3" behindDoc="0" locked="0" layoutInCell="0" allowOverlap="1">
             <wp:simplePos x="0" y="0"/>
             <wp:positionH relativeFrom="column">
               <wp:align>left</wp:align>
@@ -1811,7 +1811,7 @@
       </w:pPr>
       <w:r>
         <w:drawing>
-          <wp:anchor distT="0" distB="0" distL="0" distR="0" simplePos="0" relativeHeight="3" behindDoc="0" locked="0" layoutInCell="0" allowOverlap="1">
+          <wp:anchor distT="0" distB="0" distL="0" distR="0" simplePos="0" relativeHeight="4" behindDoc="0" locked="0" layoutInCell="0" allowOverlap="1">
             <wp:simplePos x="0" y="0"/>
             <wp:positionH relativeFrom="column">
               <wp:align>left</wp:align>
@@ -1930,7 +1930,7 @@
       </w:pPr>
       <w:r>
         <w:drawing>
-          <wp:anchor distT="0" distB="0" distL="0" distR="0" simplePos="0" relativeHeight="4" behindDoc="0" locked="0" layoutInCell="0" allowOverlap="1">
+          <wp:anchor distT="0" distB="0" distL="0" distR="0" simplePos="0" relativeHeight="5" behindDoc="0" locked="0" layoutInCell="0" allowOverlap="1">
             <wp:simplePos x="0" y="0"/>
             <wp:positionH relativeFrom="column">
               <wp:align>left</wp:align>
@@ -2036,7 +2036,7 @@
       <w:bookmarkStart w:id="5" w:name="_Toc225327549"/>
       <w:r>
         <w:drawing>
-          <wp:anchor distT="0" distB="0" distL="0" distR="0" simplePos="0" relativeHeight="5" behindDoc="0" locked="0" layoutInCell="0" allowOverlap="1">
+          <wp:anchor distT="0" distB="0" distL="0" distR="0" simplePos="0" relativeHeight="6" behindDoc="0" locked="0" layoutInCell="0" allowOverlap="1">
             <wp:simplePos x="0" y="0"/>
             <wp:positionH relativeFrom="column">
               <wp:posOffset>-6350</wp:posOffset>
@@ -2568,7 +2568,7 @@
       </w:pPr>
       <w:r>
         <w:drawing>
-          <wp:anchor distT="0" distB="0" distL="0" distR="0" simplePos="0" relativeHeight="7" behindDoc="0" locked="0" layoutInCell="0" allowOverlap="1">
+          <wp:anchor distT="0" distB="0" distL="0" distR="0" simplePos="0" relativeHeight="8" behindDoc="0" locked="0" layoutInCell="0" allowOverlap="1">
             <wp:simplePos x="0" y="0"/>
             <wp:positionH relativeFrom="column">
               <wp:align>left</wp:align>
@@ -2668,7 +2668,7 @@
       </w:pPr>
       <w:r>
         <w:drawing>
-          <wp:anchor distT="0" distB="0" distL="0" distR="0" simplePos="0" relativeHeight="6" behindDoc="0" locked="0" layoutInCell="0" allowOverlap="1">
+          <wp:anchor distT="0" distB="0" distL="0" distR="0" simplePos="0" relativeHeight="7" behindDoc="0" locked="0" layoutInCell="0" allowOverlap="1">
             <wp:simplePos x="0" y="0"/>
             <wp:positionH relativeFrom="column">
               <wp:align>left</wp:align>
@@ -4155,7 +4155,7 @@
       <w:pPr>
         <w:pStyle w:val="Heading2"/>
         <w:numPr>
-          <w:ilvl w:val="1"/>
+          <w:ilvl w:val="0"/>
           <w:numId w:val="4"/>
         </w:numPr>
         <w:rPr>
@@ -4212,7 +4212,7 @@
       </w:pPr>
       <w:r>
         <w:drawing>
-          <wp:anchor distT="0" distB="0" distL="0" distR="0" simplePos="0" relativeHeight="8" behindDoc="0" locked="0" layoutInCell="0" allowOverlap="1">
+          <wp:anchor distT="0" distB="0" distL="0" distR="0" simplePos="0" relativeHeight="9" behindDoc="0" locked="0" layoutInCell="0" allowOverlap="1">
             <wp:simplePos x="0" y="0"/>
             <wp:positionH relativeFrom="column">
               <wp:align>left</wp:align>
@@ -4317,6 +4317,49 @@
       <w:pPr>
         <w:pStyle w:val="Heading2"/>
         <w:numPr>
+          <w:ilvl w:val="1"/>
+          <w:numId w:val="4"/>
+        </w:numPr>
+        <w:rPr>
+          <w:lang w:val="en-US"/>
+        </w:rPr>
+      </w:pPr>
+      <w:r>
+        <w:rPr>
+          <w:lang w:val="en-US"/>
+        </w:rPr>
+        <w:t xml:space="preserve">Wizard </w:t>
+      </w:r>
+    </w:p>
+    <w:p>
+      <w:pPr>
+        <w:pStyle w:val="Normal"/>
+        <w:rPr>
+          <w:lang w:val="en-US"/>
+        </w:rPr>
+      </w:pPr>
+      <w:bookmarkStart w:id="6" w:name="_Toc225327554"/>
+      <w:bookmarkEnd w:id="6"/>
+      <w:r>
+        <w:rPr/>
+        <w:t>Der von RAP bereitgestellte List-Report wird um einen Wizard erweitert, der die Anwender geführt durch den Beantragungsprozess führt.</w:t>
+      </w:r>
+    </w:p>
+    <w:p>
+      <w:pPr>
+        <w:pStyle w:val="Normal"/>
+        <w:rPr>
+          <w:lang w:val="en-US"/>
+        </w:rPr>
+      </w:pPr>
+      <w:r>
+        <w:rPr/>
+      </w:r>
+    </w:p>
+    <w:p>
+      <w:pPr>
+        <w:pStyle w:val="Heading2"/>
+        <w:numPr>
           <w:ilvl w:val="2"/>
           <w:numId w:val="4"/>
         </w:numPr>
@@ -4328,29 +4371,462 @@
         <w:rPr>
           <w:lang w:val="en-US"/>
         </w:rPr>
-        <w:t>Wizard</w:t>
+        <w:t xml:space="preserve">Kategorie wählen </w:t>
       </w:r>
     </w:p>
     <w:p>
       <w:pPr>
         <w:pStyle w:val="Normal"/>
         <w:rPr>
-          <w:lang w:val="en-US"/>
-        </w:rPr>
-      </w:pPr>
-      <w:bookmarkStart w:id="6" w:name="_Toc225327554"/>
-      <w:bookmarkEnd w:id="6"/>
-      <w:r>
-        <w:rPr>
-          <w:lang w:val="en-US"/>
-        </w:rPr>
-        <w:t>Der von RAP bereitgestellte List-Report wird um einen Wizard erweitert, der die Anwender geführt durch den Beantragungsprozess führt.</w:t>
+          <w:sz w:val="16"/>
+          <w:szCs w:val="16"/>
+        </w:rPr>
+      </w:pPr>
+      <w:r>
+        <w:drawing>
+          <wp:anchor distT="0" distB="0" distL="0" distR="0" simplePos="0" relativeHeight="10" behindDoc="0" locked="0" layoutInCell="0" allowOverlap="1">
+            <wp:simplePos x="0" y="0"/>
+            <wp:positionH relativeFrom="column">
+              <wp:align>left</wp:align>
+            </wp:positionH>
+            <wp:positionV relativeFrom="paragraph">
+              <wp:posOffset>34925</wp:posOffset>
+            </wp:positionV>
+            <wp:extent cx="5760085" cy="2692400"/>
+            <wp:effectExtent l="0" t="0" r="0" b="0"/>
+            <wp:wrapTopAndBottom/>
+            <wp:docPr id="8" name="Image8"/>
+            <wp:cNvGraphicFramePr>
+              <a:graphicFrameLocks xmlns:a="http://schemas.openxmlformats.org/drawingml/2006/main" noChangeAspect="1"/>
+            </wp:cNvGraphicFramePr>
+            <a:graphic xmlns:a="http://schemas.openxmlformats.org/drawingml/2006/main">
+              <a:graphicData uri="http://schemas.openxmlformats.org/drawingml/2006/picture">
+                <pic:pic xmlns:pic="http://schemas.openxmlformats.org/drawingml/2006/picture">
+                  <pic:nvPicPr>
+                    <pic:cNvPr id="8" name="Image8"/>
+                    <pic:cNvPicPr>
+                      <a:picLocks noChangeAspect="1" noChangeArrowheads="1"/>
+                    </pic:cNvPicPr>
+                  </pic:nvPicPr>
+                  <pic:blipFill>
+                    <a:blip r:embed="rId9"/>
+                    <a:stretch>
+                      <a:fillRect/>
+                    </a:stretch>
+                  </pic:blipFill>
+                  <pic:spPr bwMode="auto">
+                    <a:xfrm>
+                      <a:off x="0" y="0"/>
+                      <a:ext cx="5760085" cy="2692400"/>
+                    </a:xfrm>
+                    <a:prstGeom prst="rect">
+                      <a:avLst/>
+                    </a:prstGeom>
+                    <a:noFill/>
+                  </pic:spPr>
+                </pic:pic>
+              </a:graphicData>
+            </a:graphic>
+          </wp:anchor>
+        </w:drawing>
+      </w:r>
+      <w:r>
+        <w:rPr>
+          <w:i/>
+          <w:iCs/>
+          <w:sz w:val="16"/>
+          <w:szCs w:val="16"/>
+        </w:rPr>
+        <w:t xml:space="preserve">Abbildung </w:t>
+      </w:r>
+      <w:r>
+        <w:rPr>
+          <w:i/>
+          <w:iCs/>
+          <w:sz w:val="16"/>
+          <w:szCs w:val="16"/>
+        </w:rPr>
+        <w:t>8</w:t>
+      </w:r>
+      <w:r>
+        <w:rPr>
+          <w:i/>
+          <w:iCs/>
+          <w:sz w:val="16"/>
+          <w:szCs w:val="16"/>
+        </w:rPr>
+        <w:t xml:space="preserve"> </w:t>
+      </w:r>
+      <w:r>
+        <w:rPr>
+          <w:i/>
+          <w:iCs/>
+          <w:sz w:val="16"/>
+          <w:szCs w:val="16"/>
+        </w:rPr>
+        <w:t>Wizard – Kategorie wählen</w:t>
+      </w:r>
+    </w:p>
+    <w:p>
+      <w:pPr>
+        <w:pStyle w:val="Normal"/>
+        <w:rPr>
+          <w:sz w:val="16"/>
+          <w:szCs w:val="16"/>
+        </w:rPr>
+      </w:pPr>
+      <w:r>
+        <w:rPr>
+          <w:i/>
+          <w:iCs/>
+          <w:sz w:val="16"/>
+          <w:szCs w:val="16"/>
+        </w:rPr>
+      </w:r>
+    </w:p>
+    <w:p>
+      <w:pPr>
+        <w:pStyle w:val="Normal"/>
+        <w:rPr>
+          <w:lang w:val="en-US"/>
+        </w:rPr>
+      </w:pPr>
+      <w:r>
+        <w:rPr>
+          <w:lang w:val="en-US"/>
+        </w:rPr>
+        <w:t xml:space="preserve">Zuerst wird </w:t>
+      </w:r>
+      <w:r>
+        <w:rPr>
+          <w:lang w:val="en-US"/>
+        </w:rPr>
+        <w:t xml:space="preserve">dem Anwender eine Oberfläche bereit gestellt, auf der er </w:t>
+      </w:r>
+      <w:r>
+        <w:rPr>
+          <w:lang w:val="en-US"/>
+        </w:rPr>
+        <w:t xml:space="preserve">die Kategorie </w:t>
+      </w:r>
+      <w:r>
+        <w:rPr>
+          <w:lang w:val="en-US"/>
+        </w:rPr>
+        <w:t xml:space="preserve">des Antrages angeben kann. </w:t>
+      </w:r>
+    </w:p>
+    <w:p>
+      <w:pPr>
+        <w:pStyle w:val="Heading2"/>
+        <w:numPr>
+          <w:ilvl w:val="2"/>
+          <w:numId w:val="4"/>
+        </w:numPr>
+        <w:rPr>
+          <w:lang w:val="en-US"/>
+        </w:rPr>
+      </w:pPr>
+      <w:r>
+        <w:rPr>
+          <w:lang w:val="en-US"/>
+        </w:rPr>
+        <w:t xml:space="preserve">Antragsinformationen </w:t>
+      </w:r>
+    </w:p>
+    <w:p>
+      <w:pPr>
+        <w:pStyle w:val="Normal"/>
+        <w:rPr>
+          <w:sz w:val="16"/>
+          <w:szCs w:val="16"/>
+        </w:rPr>
+      </w:pPr>
+      <w:r>
+        <w:drawing>
+          <wp:anchor distT="0" distB="0" distL="0" distR="0" simplePos="0" relativeHeight="11" behindDoc="0" locked="0" layoutInCell="0" allowOverlap="1">
+            <wp:simplePos x="0" y="0"/>
+            <wp:positionH relativeFrom="column">
+              <wp:align>left</wp:align>
+            </wp:positionH>
+            <wp:positionV relativeFrom="paragraph">
+              <wp:posOffset>635</wp:posOffset>
+            </wp:positionV>
+            <wp:extent cx="5760085" cy="2692400"/>
+            <wp:effectExtent l="0" t="0" r="0" b="0"/>
+            <wp:wrapTopAndBottom/>
+            <wp:docPr id="9" name="Image9"/>
+            <wp:cNvGraphicFramePr>
+              <a:graphicFrameLocks xmlns:a="http://schemas.openxmlformats.org/drawingml/2006/main" noChangeAspect="1"/>
+            </wp:cNvGraphicFramePr>
+            <a:graphic xmlns:a="http://schemas.openxmlformats.org/drawingml/2006/main">
+              <a:graphicData uri="http://schemas.openxmlformats.org/drawingml/2006/picture">
+                <pic:pic xmlns:pic="http://schemas.openxmlformats.org/drawingml/2006/picture">
+                  <pic:nvPicPr>
+                    <pic:cNvPr id="9" name="Image9"/>
+                    <pic:cNvPicPr>
+                      <a:picLocks noChangeAspect="1" noChangeArrowheads="1"/>
+                    </pic:cNvPicPr>
+                  </pic:nvPicPr>
+                  <pic:blipFill>
+                    <a:blip r:embed="rId10"/>
+                    <a:stretch>
+                      <a:fillRect/>
+                    </a:stretch>
+                  </pic:blipFill>
+                  <pic:spPr bwMode="auto">
+                    <a:xfrm>
+                      <a:off x="0" y="0"/>
+                      <a:ext cx="5760085" cy="2692400"/>
+                    </a:xfrm>
+                    <a:prstGeom prst="rect">
+                      <a:avLst/>
+                    </a:prstGeom>
+                    <a:noFill/>
+                  </pic:spPr>
+                </pic:pic>
+              </a:graphicData>
+            </a:graphic>
+          </wp:anchor>
+        </w:drawing>
+      </w:r>
+      <w:r>
+        <w:rPr>
+          <w:i/>
+          <w:iCs/>
+          <w:sz w:val="16"/>
+          <w:szCs w:val="16"/>
+        </w:rPr>
+        <w:t xml:space="preserve">Abbildung </w:t>
+      </w:r>
+      <w:r>
+        <w:rPr>
+          <w:i/>
+          <w:iCs/>
+          <w:sz w:val="16"/>
+          <w:szCs w:val="16"/>
+        </w:rPr>
+        <w:t>9</w:t>
+      </w:r>
+      <w:r>
+        <w:rPr>
+          <w:i/>
+          <w:iCs/>
+          <w:sz w:val="16"/>
+          <w:szCs w:val="16"/>
+        </w:rPr>
+        <w:t xml:space="preserve"> Wizard – </w:t>
+      </w:r>
+      <w:r>
+        <w:rPr>
+          <w:i/>
+          <w:iCs/>
+          <w:sz w:val="16"/>
+          <w:szCs w:val="16"/>
+        </w:rPr>
+        <w:t>Allgemeine Antragsinformationen</w:t>
+      </w:r>
+    </w:p>
+    <w:p>
+      <w:pPr>
+        <w:pStyle w:val="Normal"/>
+        <w:rPr>
+          <w:sz w:val="16"/>
+          <w:szCs w:val="16"/>
+        </w:rPr>
+      </w:pPr>
+      <w:r>
+        <w:rPr/>
+      </w:r>
+    </w:p>
+    <w:p>
+      <w:pPr>
+        <w:pStyle w:val="Normal"/>
+        <w:rPr>
+          <w:i w:val="false"/>
+          <w:iCs w:val="false"/>
+          <w:sz w:val="20"/>
+          <w:szCs w:val="20"/>
+        </w:rPr>
+      </w:pPr>
+      <w:r>
+        <w:rPr>
+          <w:i w:val="false"/>
+          <w:iCs w:val="false"/>
+          <w:sz w:val="20"/>
+          <w:szCs w:val="20"/>
+        </w:rPr>
+        <w:t>Der 2. Schritt b</w:t>
+      </w:r>
+      <w:r>
+        <w:rPr>
+          <w:i w:val="false"/>
+          <w:iCs w:val="false"/>
+          <w:sz w:val="20"/>
+          <w:szCs w:val="20"/>
+        </w:rPr>
+        <w:t>ietet</w:t>
+      </w:r>
+      <w:r>
+        <w:rPr>
+          <w:i w:val="false"/>
+          <w:iCs w:val="false"/>
+          <w:sz w:val="20"/>
+          <w:szCs w:val="20"/>
+        </w:rPr>
+        <w:t xml:space="preserve"> Input-Felder für den Betreff, einer kurzen Beschreibung </w:t>
+      </w:r>
+      <w:r>
+        <w:rPr>
+          <w:i w:val="false"/>
+          <w:iCs w:val="false"/>
+          <w:sz w:val="20"/>
+          <w:szCs w:val="20"/>
+        </w:rPr>
+        <w:t>und einer Checkbox für die Angabe ob die Kosten bekannt sind, oder vom Backoffice erstellt werden müssen.</w:t>
+      </w:r>
+    </w:p>
+    <w:p>
+      <w:pPr>
+        <w:pStyle w:val="Normal"/>
+        <w:rPr>
+          <w:lang w:val="en-US"/>
+        </w:rPr>
+      </w:pPr>
+      <w:r>
+        <w:rPr>
+          <w:lang w:val="en-US"/>
+        </w:rPr>
+      </w:r>
+    </w:p>
+    <w:p>
+      <w:pPr>
+        <w:pStyle w:val="Heading2"/>
+        <w:numPr>
+          <w:ilvl w:val="2"/>
+          <w:numId w:val="4"/>
+        </w:numPr>
+        <w:rPr>
+          <w:lang w:val="en-US"/>
+        </w:rPr>
+      </w:pPr>
+      <w:r>
+        <w:rPr>
+          <w:lang w:val="en-US"/>
+        </w:rPr>
+        <w:t>Angebotskosten</w:t>
+      </w:r>
+    </w:p>
+    <w:p>
+      <w:pPr>
+        <w:pStyle w:val="Normal"/>
+        <w:rPr>
+          <w:sz w:val="16"/>
+          <w:szCs w:val="16"/>
+        </w:rPr>
+      </w:pPr>
+      <w:r>
+        <w:drawing>
+          <wp:anchor distT="0" distB="0" distL="0" distR="0" simplePos="0" relativeHeight="12" behindDoc="0" locked="0" layoutInCell="0" allowOverlap="1">
+            <wp:simplePos x="0" y="0"/>
+            <wp:positionH relativeFrom="column">
+              <wp:align>center</wp:align>
+            </wp:positionH>
+            <wp:positionV relativeFrom="paragraph">
+              <wp:posOffset>635</wp:posOffset>
+            </wp:positionV>
+            <wp:extent cx="5760085" cy="3656965"/>
+            <wp:effectExtent l="0" t="0" r="0" b="0"/>
+            <wp:wrapSquare wrapText="largest"/>
+            <wp:docPr id="10" name="Image10"/>
+            <wp:cNvGraphicFramePr>
+              <a:graphicFrameLocks xmlns:a="http://schemas.openxmlformats.org/drawingml/2006/main" noChangeAspect="1"/>
+            </wp:cNvGraphicFramePr>
+            <a:graphic xmlns:a="http://schemas.openxmlformats.org/drawingml/2006/main">
+              <a:graphicData uri="http://schemas.openxmlformats.org/drawingml/2006/picture">
+                <pic:pic xmlns:pic="http://schemas.openxmlformats.org/drawingml/2006/picture">
+                  <pic:nvPicPr>
+                    <pic:cNvPr id="10" name="Image10"/>
+                    <pic:cNvPicPr>
+                      <a:picLocks noChangeAspect="1" noChangeArrowheads="1"/>
+                    </pic:cNvPicPr>
+                  </pic:nvPicPr>
+                  <pic:blipFill>
+                    <a:blip r:embed="rId11"/>
+                    <a:stretch>
+                      <a:fillRect/>
+                    </a:stretch>
+                  </pic:blipFill>
+                  <pic:spPr bwMode="auto">
+                    <a:xfrm>
+                      <a:off x="0" y="0"/>
+                      <a:ext cx="5760085" cy="3656965"/>
+                    </a:xfrm>
+                    <a:prstGeom prst="rect">
+                      <a:avLst/>
+                    </a:prstGeom>
+                    <a:noFill/>
+                  </pic:spPr>
+                </pic:pic>
+              </a:graphicData>
+            </a:graphic>
+          </wp:anchor>
+        </w:drawing>
+      </w:r>
+      <w:r>
+        <w:rPr>
+          <w:i/>
+          <w:iCs/>
+          <w:sz w:val="16"/>
+          <w:szCs w:val="16"/>
+        </w:rPr>
+        <w:t xml:space="preserve">Abbildung </w:t>
+      </w:r>
+      <w:r>
+        <w:rPr>
+          <w:i/>
+          <w:iCs/>
+          <w:sz w:val="16"/>
+          <w:szCs w:val="16"/>
+        </w:rPr>
+        <w:t>10</w:t>
+      </w:r>
+      <w:r>
+        <w:rPr>
+          <w:i/>
+          <w:iCs/>
+          <w:sz w:val="16"/>
+          <w:szCs w:val="16"/>
+        </w:rPr>
+        <w:t xml:space="preserve"> Wizard – </w:t>
+      </w:r>
+      <w:r>
+        <w:rPr>
+          <w:i/>
+          <w:iCs/>
+          <w:sz w:val="16"/>
+          <w:szCs w:val="16"/>
+        </w:rPr>
+        <w:t>Angebotskosten</w:t>
+      </w:r>
+    </w:p>
+    <w:p>
+      <w:pPr>
+        <w:pStyle w:val="Normal"/>
+        <w:rPr>
+          <w:lang w:val="en-US"/>
+        </w:rPr>
+      </w:pPr>
+      <w:r>
+        <w:rPr>
+          <w:lang w:val="en-US"/>
+        </w:rPr>
       </w:r>
     </w:p>
     <w:sectPr>
-      <w:headerReference w:type="even" r:id="rId9"/>
-      <w:headerReference w:type="default" r:id="rId10"/>
-      <w:headerReference w:type="first" r:id="rId11"/>
+      <w:headerReference w:type="even" r:id="rId12"/>
+      <w:headerReference w:type="default" r:id="rId13"/>
+      <w:headerReference w:type="first" r:id="rId14"/>
       <w:type w:val="nextPage"/>
       <w:pgSz w:w="11906" w:h="16838"/>
       <w:pgMar w:left="1701" w:right="1134" w:gutter="0" w:header="426" w:top="1702" w:footer="0" w:bottom="1134"/>
@@ -4414,7 +4890,7 @@
     </w:pPr>
     <w:r>
       <w:pict>
-        <v:shape id="shape_0" coordsize="2609,901" stroked="f" o:allowincell="f" style="position:absolute;margin-left:370.6pt;margin-top:3.55pt;width:73.85pt;height:25.45pt;mso-wrap-style:none;v-text-anchor:middle;mso-position-horizontal:right;mso-position-horizontal-relative:margin" path="m0,0l2608,0l2608,900l0,900l0,0e">
+        <v:shape id="shape_0" coordsize="2605,898" stroked="f" o:allowincell="f" style="position:absolute;margin-left:370.7pt;margin-top:3.55pt;width:73.75pt;height:25.35pt;mso-wrap-style:none;v-text-anchor:middle;mso-position-horizontal:right;mso-position-horizontal-relative:margin" path="m0,0l2604,0l2604,897l0,897l0,0e">
           <v:fill r:id="rId1" o:detectmouseclick="t" type="frame" color2="black"/>
           <v:stroke color="#3465a4" joinstyle="round" endcap="flat"/>
           <w10:wrap type="square"/>
@@ -6510,7 +6986,7 @@
     <w:pPr>
       <w:widowControl/>
       <w:suppressAutoHyphens w:val="true"/>
-      <w:overflowPunct w:val="true"/>
+      <w:overflowPunct w:val="false"/>
       <w:bidi w:val="0"/>
       <w:spacing w:lineRule="auto" w:line="264" w:before="60" w:after="0"/>
       <w:jc w:val="both"/>
@@ -7051,8 +7527,8 @@
     <w:qFormat/>
     <w:rPr/>
   </w:style>
-  <w:style w:type="character" w:styleId="Bulletsuser">
-    <w:name w:val="Bullets (user)"/>
+  <w:style w:type="character" w:styleId="Bullets">
+    <w:name w:val="Bullets"/>
     <w:qFormat/>
     <w:rPr>
       <w:rFonts w:ascii="OpenSymbol" w:hAnsi="OpenSymbol" w:eastAsia="OpenSymbol" w:cs="OpenSymbol"/>
@@ -7309,7 +7785,7 @@
     <w:basedOn w:val="Normal"/>
     <w:link w:val="FunotentextZchn"/>
     <w:pPr>
-      <w:overflowPunct w:val="false"/>
+      <w:overflowPunct w:val="true"/>
       <w:spacing w:lineRule="auto" w:line="312" w:before="120" w:after="0"/>
       <w:textAlignment w:val="baseline"/>
     </w:pPr>
@@ -7364,7 +7840,7 @@
         <w:left w:val="single" w:sz="24" w:space="24" w:color="5B9BD5"/>
       </w:pBdr>
       <w:suppressAutoHyphens w:val="true"/>
-      <w:overflowPunct w:val="true"/>
+      <w:overflowPunct w:val="false"/>
       <w:bidi w:val="0"/>
       <w:spacing w:before="60" w:after="60"/>
       <w:ind w:left="851"/>
@@ -7596,7 +8072,7 @@
     <w:pPr>
       <w:widowControl/>
       <w:suppressAutoHyphens w:val="true"/>
-      <w:overflowPunct w:val="true"/>
+      <w:overflowPunct w:val="false"/>
       <w:bidi w:val="0"/>
       <w:spacing w:before="0" w:after="0"/>
       <w:jc w:val="left"/>
@@ -7631,8 +8107,8 @@
       <w:lang w:eastAsia="en-US"/>
     </w:rPr>
   </w:style>
-  <w:style w:type="paragraph" w:styleId="BlockQuotationuser">
-    <w:name w:val="Block Quotation (user)"/>
+  <w:style w:type="paragraph" w:styleId="BlockQuotation">
+    <w:name w:val="Block Quotation"/>
     <w:basedOn w:val="Normal"/>
     <w:qFormat/>
     <w:pPr>

</xml_diff>